<commit_message>
progress board: widen the evidence column
</commit_message>
<xml_diff>
--- a/PROGRESS_BOARD.docx
+++ b/PROGRESS_BOARD.docx
@@ -380,7 +380,7 @@
         </w:trPr>
         <w:tc>
           <w:tcPr>
-            <w:tcW w:type="dxa" w:w="1996"/>
+            <w:tcW w:type="dxa" w:w="510"/>
             <w:shd w:val="clear" w:color="auto" w:fill="EFEFEF"/>
           </w:tcPr>
           <w:p>
@@ -402,7 +402,7 @@
         </w:tc>
         <w:tc>
           <w:tcPr>
-            <w:tcW w:type="dxa" w:w="1996"/>
+            <w:tcW w:type="dxa" w:w="1701"/>
             <w:shd w:val="clear" w:color="auto" w:fill="EFEFEF"/>
           </w:tcPr>
           <w:p>
@@ -424,7 +424,7 @@
         </w:tc>
         <w:tc>
           <w:tcPr>
-            <w:tcW w:type="dxa" w:w="1996"/>
+            <w:tcW w:type="dxa" w:w="1474"/>
             <w:shd w:val="clear" w:color="auto" w:fill="EFEFEF"/>
           </w:tcPr>
           <w:p>
@@ -446,7 +446,7 @@
         </w:tc>
         <w:tc>
           <w:tcPr>
-            <w:tcW w:type="dxa" w:w="1996"/>
+            <w:tcW w:type="dxa" w:w="1644"/>
             <w:shd w:val="clear" w:color="auto" w:fill="EFEFEF"/>
           </w:tcPr>
           <w:p>
@@ -468,7 +468,7 @@
         </w:tc>
         <w:tc>
           <w:tcPr>
-            <w:tcW w:type="dxa" w:w="1996"/>
+            <w:tcW w:type="dxa" w:w="2381"/>
             <w:shd w:val="clear" w:color="auto" w:fill="EFEFEF"/>
           </w:tcPr>
           <w:p>
@@ -492,7 +492,7 @@
       <w:tr>
         <w:tc>
           <w:tcPr>
-            <w:tcW w:type="dxa" w:w="1996"/>
+            <w:tcW w:type="dxa" w:w="510"/>
           </w:tcPr>
           <w:p>
             <w:pPr>
@@ -512,7 +512,7 @@
         </w:tc>
         <w:tc>
           <w:tcPr>
-            <w:tcW w:type="dxa" w:w="1996"/>
+            <w:tcW w:type="dxa" w:w="1701"/>
           </w:tcPr>
           <w:p>
             <w:pPr>
@@ -532,7 +532,7 @@
         </w:tc>
         <w:tc>
           <w:tcPr>
-            <w:tcW w:type="dxa" w:w="1996"/>
+            <w:tcW w:type="dxa" w:w="1474"/>
           </w:tcPr>
           <w:p>
             <w:pPr>
@@ -570,7 +570,7 @@
         </w:tc>
         <w:tc>
           <w:tcPr>
-            <w:tcW w:type="dxa" w:w="1996"/>
+            <w:tcW w:type="dxa" w:w="1644"/>
           </w:tcPr>
           <w:p>
             <w:pPr>
@@ -599,7 +599,7 @@
         </w:tc>
         <w:tc>
           <w:tcPr>
-            <w:tcW w:type="dxa" w:w="1996"/>
+            <w:tcW w:type="dxa" w:w="2381"/>
           </w:tcPr>
           <w:p>
             <w:pPr>
@@ -693,7 +693,7 @@
       <w:tr>
         <w:tc>
           <w:tcPr>
-            <w:tcW w:type="dxa" w:w="1996"/>
+            <w:tcW w:type="dxa" w:w="510"/>
           </w:tcPr>
           <w:p>
             <w:pPr>
@@ -713,7 +713,7 @@
         </w:tc>
         <w:tc>
           <w:tcPr>
-            <w:tcW w:type="dxa" w:w="1996"/>
+            <w:tcW w:type="dxa" w:w="1701"/>
           </w:tcPr>
           <w:p>
             <w:pPr>
@@ -733,7 +733,7 @@
         </w:tc>
         <w:tc>
           <w:tcPr>
-            <w:tcW w:type="dxa" w:w="1996"/>
+            <w:tcW w:type="dxa" w:w="1474"/>
           </w:tcPr>
           <w:p>
             <w:pPr>
@@ -771,7 +771,7 @@
         </w:tc>
         <w:tc>
           <w:tcPr>
-            <w:tcW w:type="dxa" w:w="1996"/>
+            <w:tcW w:type="dxa" w:w="1644"/>
           </w:tcPr>
           <w:p>
             <w:pPr>
@@ -800,7 +800,7 @@
         </w:tc>
         <w:tc>
           <w:tcPr>
-            <w:tcW w:type="dxa" w:w="1996"/>
+            <w:tcW w:type="dxa" w:w="2381"/>
           </w:tcPr>
           <w:p>
             <w:pPr>
@@ -876,7 +876,7 @@
       <w:tr>
         <w:tc>
           <w:tcPr>
-            <w:tcW w:type="dxa" w:w="1996"/>
+            <w:tcW w:type="dxa" w:w="510"/>
           </w:tcPr>
           <w:p>
             <w:pPr>
@@ -896,7 +896,7 @@
         </w:tc>
         <w:tc>
           <w:tcPr>
-            <w:tcW w:type="dxa" w:w="1996"/>
+            <w:tcW w:type="dxa" w:w="1701"/>
           </w:tcPr>
           <w:p>
             <w:pPr>
@@ -916,7 +916,7 @@
         </w:tc>
         <w:tc>
           <w:tcPr>
-            <w:tcW w:type="dxa" w:w="1996"/>
+            <w:tcW w:type="dxa" w:w="1474"/>
           </w:tcPr>
           <w:p>
             <w:pPr>
@@ -936,7 +936,7 @@
         </w:tc>
         <w:tc>
           <w:tcPr>
-            <w:tcW w:type="dxa" w:w="1996"/>
+            <w:tcW w:type="dxa" w:w="1644"/>
           </w:tcPr>
           <w:p>
             <w:pPr>
@@ -965,7 +965,7 @@
         </w:tc>
         <w:tc>
           <w:tcPr>
-            <w:tcW w:type="dxa" w:w="1996"/>
+            <w:tcW w:type="dxa" w:w="2381"/>
           </w:tcPr>
           <w:p>
             <w:pPr>
@@ -987,7 +987,7 @@
       <w:tr>
         <w:tc>
           <w:tcPr>
-            <w:tcW w:type="dxa" w:w="1996"/>
+            <w:tcW w:type="dxa" w:w="510"/>
           </w:tcPr>
           <w:p>
             <w:pPr>
@@ -1007,7 +1007,7 @@
         </w:tc>
         <w:tc>
           <w:tcPr>
-            <w:tcW w:type="dxa" w:w="1996"/>
+            <w:tcW w:type="dxa" w:w="1701"/>
           </w:tcPr>
           <w:p>
             <w:pPr>
@@ -1027,7 +1027,7 @@
         </w:tc>
         <w:tc>
           <w:tcPr>
-            <w:tcW w:type="dxa" w:w="1996"/>
+            <w:tcW w:type="dxa" w:w="1474"/>
           </w:tcPr>
           <w:p>
             <w:pPr>
@@ -1047,7 +1047,7 @@
         </w:tc>
         <w:tc>
           <w:tcPr>
-            <w:tcW w:type="dxa" w:w="1996"/>
+            <w:tcW w:type="dxa" w:w="1644"/>
           </w:tcPr>
           <w:p>
             <w:pPr>
@@ -1076,7 +1076,7 @@
         </w:tc>
         <w:tc>
           <w:tcPr>
-            <w:tcW w:type="dxa" w:w="1996"/>
+            <w:tcW w:type="dxa" w:w="2381"/>
           </w:tcPr>
           <w:p>
             <w:pPr>
@@ -1098,7 +1098,7 @@
       <w:tr>
         <w:tc>
           <w:tcPr>
-            <w:tcW w:type="dxa" w:w="1996"/>
+            <w:tcW w:type="dxa" w:w="510"/>
           </w:tcPr>
           <w:p>
             <w:pPr>
@@ -1118,7 +1118,7 @@
         </w:tc>
         <w:tc>
           <w:tcPr>
-            <w:tcW w:type="dxa" w:w="1996"/>
+            <w:tcW w:type="dxa" w:w="1701"/>
           </w:tcPr>
           <w:p>
             <w:pPr>
@@ -1138,7 +1138,7 @@
         </w:tc>
         <w:tc>
           <w:tcPr>
-            <w:tcW w:type="dxa" w:w="1996"/>
+            <w:tcW w:type="dxa" w:w="1474"/>
           </w:tcPr>
           <w:p>
             <w:pPr>
@@ -1158,7 +1158,7 @@
         </w:tc>
         <w:tc>
           <w:tcPr>
-            <w:tcW w:type="dxa" w:w="1996"/>
+            <w:tcW w:type="dxa" w:w="1644"/>
           </w:tcPr>
           <w:p>
             <w:pPr>
@@ -1187,7 +1187,7 @@
         </w:tc>
         <w:tc>
           <w:tcPr>
-            <w:tcW w:type="dxa" w:w="1996"/>
+            <w:tcW w:type="dxa" w:w="2381"/>
           </w:tcPr>
           <w:p>
             <w:pPr>
@@ -1209,7 +1209,7 @@
       <w:tr>
         <w:tc>
           <w:tcPr>
-            <w:tcW w:type="dxa" w:w="1996"/>
+            <w:tcW w:type="dxa" w:w="510"/>
           </w:tcPr>
           <w:p>
             <w:pPr>
@@ -1229,7 +1229,7 @@
         </w:tc>
         <w:tc>
           <w:tcPr>
-            <w:tcW w:type="dxa" w:w="1996"/>
+            <w:tcW w:type="dxa" w:w="1701"/>
           </w:tcPr>
           <w:p>
             <w:pPr>
@@ -1249,7 +1249,7 @@
         </w:tc>
         <w:tc>
           <w:tcPr>
-            <w:tcW w:type="dxa" w:w="1996"/>
+            <w:tcW w:type="dxa" w:w="1474"/>
           </w:tcPr>
           <w:p>
             <w:pPr>
@@ -1269,7 +1269,7 @@
         </w:tc>
         <w:tc>
           <w:tcPr>
-            <w:tcW w:type="dxa" w:w="1996"/>
+            <w:tcW w:type="dxa" w:w="1644"/>
           </w:tcPr>
           <w:p>
             <w:pPr>
@@ -1298,7 +1298,7 @@
         </w:tc>
         <w:tc>
           <w:tcPr>
-            <w:tcW w:type="dxa" w:w="1996"/>
+            <w:tcW w:type="dxa" w:w="2381"/>
           </w:tcPr>
           <w:p>
             <w:pPr>
@@ -1320,7 +1320,7 @@
       <w:tr>
         <w:tc>
           <w:tcPr>
-            <w:tcW w:type="dxa" w:w="1996"/>
+            <w:tcW w:type="dxa" w:w="510"/>
           </w:tcPr>
           <w:p>
             <w:pPr>
@@ -1340,7 +1340,7 @@
         </w:tc>
         <w:tc>
           <w:tcPr>
-            <w:tcW w:type="dxa" w:w="1996"/>
+            <w:tcW w:type="dxa" w:w="1701"/>
           </w:tcPr>
           <w:p>
             <w:pPr>
@@ -1360,7 +1360,7 @@
         </w:tc>
         <w:tc>
           <w:tcPr>
-            <w:tcW w:type="dxa" w:w="1996"/>
+            <w:tcW w:type="dxa" w:w="1474"/>
           </w:tcPr>
           <w:p>
             <w:pPr>
@@ -1380,7 +1380,7 @@
         </w:tc>
         <w:tc>
           <w:tcPr>
-            <w:tcW w:type="dxa" w:w="1996"/>
+            <w:tcW w:type="dxa" w:w="1644"/>
           </w:tcPr>
           <w:p>
             <w:pPr>
@@ -1409,7 +1409,7 @@
         </w:tc>
         <w:tc>
           <w:tcPr>
-            <w:tcW w:type="dxa" w:w="1996"/>
+            <w:tcW w:type="dxa" w:w="2381"/>
           </w:tcPr>
           <w:p>
             <w:pPr>
@@ -1431,7 +1431,7 @@
       <w:tr>
         <w:tc>
           <w:tcPr>
-            <w:tcW w:type="dxa" w:w="1996"/>
+            <w:tcW w:type="dxa" w:w="510"/>
           </w:tcPr>
           <w:p>
             <w:pPr>
@@ -1451,7 +1451,7 @@
         </w:tc>
         <w:tc>
           <w:tcPr>
-            <w:tcW w:type="dxa" w:w="1996"/>
+            <w:tcW w:type="dxa" w:w="1701"/>
           </w:tcPr>
           <w:p>
             <w:pPr>
@@ -1471,7 +1471,7 @@
         </w:tc>
         <w:tc>
           <w:tcPr>
-            <w:tcW w:type="dxa" w:w="1996"/>
+            <w:tcW w:type="dxa" w:w="1474"/>
           </w:tcPr>
           <w:p>
             <w:pPr>
@@ -1491,7 +1491,7 @@
         </w:tc>
         <w:tc>
           <w:tcPr>
-            <w:tcW w:type="dxa" w:w="1996"/>
+            <w:tcW w:type="dxa" w:w="1644"/>
           </w:tcPr>
           <w:p>
             <w:pPr>
@@ -1520,7 +1520,7 @@
         </w:tc>
         <w:tc>
           <w:tcPr>
-            <w:tcW w:type="dxa" w:w="1996"/>
+            <w:tcW w:type="dxa" w:w="2381"/>
           </w:tcPr>
           <w:p>
             <w:pPr>
@@ -1542,7 +1542,7 @@
       <w:tr>
         <w:tc>
           <w:tcPr>
-            <w:tcW w:type="dxa" w:w="1996"/>
+            <w:tcW w:type="dxa" w:w="510"/>
           </w:tcPr>
           <w:p>
             <w:pPr>
@@ -1562,7 +1562,7 @@
         </w:tc>
         <w:tc>
           <w:tcPr>
-            <w:tcW w:type="dxa" w:w="1996"/>
+            <w:tcW w:type="dxa" w:w="1701"/>
           </w:tcPr>
           <w:p>
             <w:pPr>
@@ -1582,7 +1582,7 @@
         </w:tc>
         <w:tc>
           <w:tcPr>
-            <w:tcW w:type="dxa" w:w="1996"/>
+            <w:tcW w:type="dxa" w:w="1474"/>
           </w:tcPr>
           <w:p>
             <w:pPr>
@@ -1602,7 +1602,7 @@
         </w:tc>
         <w:tc>
           <w:tcPr>
-            <w:tcW w:type="dxa" w:w="1996"/>
+            <w:tcW w:type="dxa" w:w="1644"/>
           </w:tcPr>
           <w:p>
             <w:pPr>
@@ -1631,7 +1631,7 @@
         </w:tc>
         <w:tc>
           <w:tcPr>
-            <w:tcW w:type="dxa" w:w="1996"/>
+            <w:tcW w:type="dxa" w:w="2381"/>
           </w:tcPr>
           <w:p>
             <w:pPr>
@@ -1653,7 +1653,7 @@
       <w:tr>
         <w:tc>
           <w:tcPr>
-            <w:tcW w:type="dxa" w:w="1996"/>
+            <w:tcW w:type="dxa" w:w="510"/>
           </w:tcPr>
           <w:p>
             <w:pPr>
@@ -1673,7 +1673,7 @@
         </w:tc>
         <w:tc>
           <w:tcPr>
-            <w:tcW w:type="dxa" w:w="1996"/>
+            <w:tcW w:type="dxa" w:w="1701"/>
           </w:tcPr>
           <w:p>
             <w:pPr>
@@ -1693,7 +1693,7 @@
         </w:tc>
         <w:tc>
           <w:tcPr>
-            <w:tcW w:type="dxa" w:w="1996"/>
+            <w:tcW w:type="dxa" w:w="1474"/>
           </w:tcPr>
           <w:p>
             <w:pPr>
@@ -1713,7 +1713,7 @@
         </w:tc>
         <w:tc>
           <w:tcPr>
-            <w:tcW w:type="dxa" w:w="1996"/>
+            <w:tcW w:type="dxa" w:w="1644"/>
           </w:tcPr>
           <w:p>
             <w:pPr>
@@ -1742,7 +1742,7 @@
         </w:tc>
         <w:tc>
           <w:tcPr>
-            <w:tcW w:type="dxa" w:w="1996"/>
+            <w:tcW w:type="dxa" w:w="2381"/>
           </w:tcPr>
           <w:p>
             <w:pPr>
@@ -2421,7 +2421,7 @@
         </w:trPr>
         <w:tc>
           <w:tcPr>
-            <w:tcW w:type="dxa" w:w="3326"/>
+            <w:tcW w:type="dxa" w:w="1077"/>
             <w:shd w:val="clear" w:color="auto" w:fill="EFEFEF"/>
           </w:tcPr>
           <w:p>
@@ -2435,7 +2435,7 @@
                 <w:rFonts w:ascii="Segoe UI Semibold" w:hAnsi="Segoe UI Semibold" w:eastAsia="微软雅黑"/>
                 <w:b/>
                 <w:i w:val="0"/>
-                <w:sz w:val="16"/>
+                <w:sz w:val="17"/>
               </w:rPr>
               <w:t>节</w:t>
             </w:r>
@@ -2443,7 +2443,7 @@
         </w:tc>
         <w:tc>
           <w:tcPr>
-            <w:tcW w:type="dxa" w:w="3326"/>
+            <w:tcW w:type="dxa" w:w="3175"/>
             <w:shd w:val="clear" w:color="auto" w:fill="EFEFEF"/>
           </w:tcPr>
           <w:p>
@@ -2457,7 +2457,7 @@
                 <w:rFonts w:ascii="Segoe UI Semibold" w:hAnsi="Segoe UI Semibold" w:eastAsia="微软雅黑"/>
                 <w:b/>
                 <w:i w:val="0"/>
-                <w:sz w:val="16"/>
+                <w:sz w:val="17"/>
               </w:rPr>
               <w:t>写什么</w:t>
             </w:r>
@@ -2465,7 +2465,7 @@
         </w:tc>
         <w:tc>
           <w:tcPr>
-            <w:tcW w:type="dxa" w:w="3326"/>
+            <w:tcW w:type="dxa" w:w="2891"/>
             <w:shd w:val="clear" w:color="auto" w:fill="EFEFEF"/>
           </w:tcPr>
           <w:p>
@@ -2479,7 +2479,7 @@
                 <w:rFonts w:ascii="Segoe UI Semibold" w:hAnsi="Segoe UI Semibold" w:eastAsia="微软雅黑"/>
                 <w:b/>
                 <w:i w:val="0"/>
-                <w:sz w:val="16"/>
+                <w:sz w:val="17"/>
               </w:rPr>
               <w:t>导师怎么看出"这周真的做了事"</w:t>
             </w:r>
@@ -2489,7 +2489,7 @@
       <w:tr>
         <w:tc>
           <w:tcPr>
-            <w:tcW w:type="dxa" w:w="3326"/>
+            <w:tcW w:type="dxa" w:w="1077"/>
           </w:tcPr>
           <w:p>
             <w:pPr>
@@ -2501,7 +2501,7 @@
                 <w:rFonts w:ascii="Segoe UI" w:hAnsi="Segoe UI" w:eastAsia="宋体"/>
                 <w:b/>
                 <w:i w:val="0"/>
-                <w:sz w:val="16"/>
+                <w:sz w:val="17"/>
               </w:rPr>
               <w:t>0 一句话结论</w:t>
             </w:r>
@@ -2509,7 +2509,7 @@
         </w:tc>
         <w:tc>
           <w:tcPr>
-            <w:tcW w:type="dxa" w:w="3326"/>
+            <w:tcW w:type="dxa" w:w="3175"/>
           </w:tcPr>
           <w:p>
             <w:pPr>
@@ -2521,7 +2521,7 @@
                 <w:rFonts w:ascii="Segoe UI" w:hAnsi="Segoe UI" w:eastAsia="宋体"/>
                 <w:b w:val="0"/>
                 <w:i w:val="0"/>
-                <w:sz w:val="16"/>
+                <w:sz w:val="17"/>
               </w:rPr>
               <w:t>本周最重要的一件事 + 是否达成</w:t>
             </w:r>
@@ -2529,7 +2529,7 @@
         </w:tc>
         <w:tc>
           <w:tcPr>
-            <w:tcW w:type="dxa" w:w="3326"/>
+            <w:tcW w:type="dxa" w:w="2891"/>
           </w:tcPr>
           <w:p>
             <w:pPr>
@@ -2541,7 +2541,7 @@
                 <w:rFonts w:ascii="Segoe UI" w:hAnsi="Segoe UI" w:eastAsia="宋体"/>
                 <w:b w:val="0"/>
                 <w:i w:val="0"/>
-                <w:sz w:val="16"/>
+                <w:sz w:val="17"/>
               </w:rPr>
               <w:t>有没有"结论"而不是"过程"</w:t>
             </w:r>
@@ -2551,7 +2551,7 @@
       <w:tr>
         <w:tc>
           <w:tcPr>
-            <w:tcW w:type="dxa" w:w="3326"/>
+            <w:tcW w:type="dxa" w:w="1077"/>
           </w:tcPr>
           <w:p>
             <w:pPr>
@@ -2563,7 +2563,7 @@
                 <w:rFonts w:ascii="Segoe UI" w:hAnsi="Segoe UI" w:eastAsia="宋体"/>
                 <w:b/>
                 <w:i w:val="0"/>
-                <w:sz w:val="16"/>
+                <w:sz w:val="17"/>
               </w:rPr>
               <w:t>1 Done</w:t>
             </w:r>
@@ -2571,7 +2571,7 @@
         </w:tc>
         <w:tc>
           <w:tcPr>
-            <w:tcW w:type="dxa" w:w="3326"/>
+            <w:tcW w:type="dxa" w:w="3175"/>
           </w:tcPr>
           <w:p>
             <w:pPr>
@@ -2583,7 +2583,7 @@
                 <w:rFonts w:ascii="Segoe UI" w:hAnsi="Segoe UI" w:eastAsia="宋体"/>
                 <w:b w:val="0"/>
                 <w:i w:val="0"/>
-                <w:sz w:val="16"/>
+                <w:sz w:val="17"/>
               </w:rPr>
               <w:t>任务 / 计划 h / 实际 h / 产物路径 / 状态</w:t>
             </w:r>
@@ -2591,7 +2591,7 @@
         </w:tc>
         <w:tc>
           <w:tcPr>
-            <w:tcW w:type="dxa" w:w="3326"/>
+            <w:tcW w:type="dxa" w:w="2891"/>
           </w:tcPr>
           <w:p>
             <w:pPr>
@@ -2603,7 +2603,7 @@
                 <w:rFonts w:ascii="Segoe UI" w:hAnsi="Segoe UI" w:eastAsia="宋体"/>
                 <w:b w:val="0"/>
                 <w:i w:val="0"/>
-                <w:sz w:val="16"/>
+                <w:sz w:val="17"/>
               </w:rPr>
               <w:t>产物路径必须存在；h 不能全是整数</w:t>
             </w:r>
@@ -2613,7 +2613,7 @@
       <w:tr>
         <w:tc>
           <w:tcPr>
-            <w:tcW w:type="dxa" w:w="3326"/>
+            <w:tcW w:type="dxa" w:w="1077"/>
           </w:tcPr>
           <w:p>
             <w:pPr>
@@ -2625,7 +2625,7 @@
                 <w:rFonts w:ascii="Segoe UI" w:hAnsi="Segoe UI" w:eastAsia="宋体"/>
                 <w:b/>
                 <w:i w:val="0"/>
-                <w:sz w:val="16"/>
+                <w:sz w:val="17"/>
               </w:rPr>
               <w:t>2 Evidence</w:t>
             </w:r>
@@ -2633,7 +2633,7 @@
         </w:tc>
         <w:tc>
           <w:tcPr>
-            <w:tcW w:type="dxa" w:w="3326"/>
+            <w:tcW w:type="dxa" w:w="3175"/>
           </w:tcPr>
           <w:p>
             <w:pPr>
@@ -2645,7 +2645,7 @@
                 <w:rFonts w:ascii="Segoe UI" w:hAnsi="Segoe UI" w:eastAsia="宋体"/>
                 <w:b/>
                 <w:i w:val="0"/>
-                <w:sz w:val="16"/>
+                <w:sz w:val="17"/>
               </w:rPr>
               <w:t>一个主表</w:t>
             </w:r>
@@ -2654,7 +2654,7 @@
                 <w:rFonts w:ascii="Segoe UI" w:hAnsi="Segoe UI" w:eastAsia="宋体"/>
                 <w:b w:val="0"/>
                 <w:i w:val="0"/>
-                <w:sz w:val="16"/>
+                <w:sz w:val="17"/>
               </w:rPr>
               <w:t>（本周最关键的数字）+ 配置 + 数据划分 + 日志路径 + 复现命令</w:t>
             </w:r>
@@ -2662,7 +2662,7 @@
         </w:tc>
         <w:tc>
           <w:tcPr>
-            <w:tcW w:type="dxa" w:w="3326"/>
+            <w:tcW w:type="dxa" w:w="2891"/>
           </w:tcPr>
           <w:p>
             <w:pPr>
@@ -2674,7 +2674,7 @@
                 <w:rFonts w:ascii="Segoe UI" w:hAnsi="Segoe UI" w:eastAsia="宋体"/>
                 <w:b w:val="0"/>
                 <w:i w:val="0"/>
-                <w:sz w:val="16"/>
+                <w:sz w:val="17"/>
               </w:rPr>
               <w:t>主表要有分母；配置要能追到 commit/哈希</w:t>
             </w:r>
@@ -2684,7 +2684,7 @@
       <w:tr>
         <w:tc>
           <w:tcPr>
-            <w:tcW w:type="dxa" w:w="3326"/>
+            <w:tcW w:type="dxa" w:w="1077"/>
           </w:tcPr>
           <w:p>
             <w:pPr>
@@ -2696,7 +2696,7 @@
                 <w:rFonts w:ascii="Segoe UI" w:hAnsi="Segoe UI" w:eastAsia="宋体"/>
                 <w:b/>
                 <w:i w:val="0"/>
-                <w:sz w:val="16"/>
+                <w:sz w:val="17"/>
               </w:rPr>
               <w:t>3 Blockers</w:t>
             </w:r>
@@ -2704,7 +2704,7 @@
         </w:tc>
         <w:tc>
           <w:tcPr>
-            <w:tcW w:type="dxa" w:w="3326"/>
+            <w:tcW w:type="dxa" w:w="3175"/>
           </w:tcPr>
           <w:p>
             <w:pPr>
@@ -2716,7 +2716,7 @@
                 <w:rFonts w:ascii="Segoe UI" w:hAnsi="Segoe UI" w:eastAsia="宋体"/>
                 <w:b w:val="0"/>
                 <w:i w:val="0"/>
-                <w:sz w:val="16"/>
+                <w:sz w:val="17"/>
               </w:rPr>
               <w:t>现象 / 已尝试 / 需要什么支持</w:t>
             </w:r>
@@ -2724,7 +2724,7 @@
         </w:tc>
         <w:tc>
           <w:tcPr>
-            <w:tcW w:type="dxa" w:w="3326"/>
+            <w:tcW w:type="dxa" w:w="2891"/>
           </w:tcPr>
           <w:p>
             <w:pPr>
@@ -2736,7 +2736,7 @@
                 <w:rFonts w:ascii="Segoe UI" w:hAnsi="Segoe UI" w:eastAsia="宋体"/>
                 <w:b w:val="0"/>
                 <w:i w:val="0"/>
-                <w:sz w:val="16"/>
+                <w:sz w:val="17"/>
               </w:rPr>
               <w:t>"已尝试"是不是列了具体手段</w:t>
             </w:r>
@@ -2746,7 +2746,7 @@
       <w:tr>
         <w:tc>
           <w:tcPr>
-            <w:tcW w:type="dxa" w:w="3326"/>
+            <w:tcW w:type="dxa" w:w="1077"/>
           </w:tcPr>
           <w:p>
             <w:pPr>
@@ -2758,7 +2758,7 @@
                 <w:rFonts w:ascii="Segoe UI" w:hAnsi="Segoe UI" w:eastAsia="宋体"/>
                 <w:b/>
                 <w:i w:val="0"/>
-                <w:sz w:val="16"/>
+                <w:sz w:val="17"/>
               </w:rPr>
               <w:t>4 Next</w:t>
             </w:r>
@@ -2766,7 +2766,7 @@
         </w:tc>
         <w:tc>
           <w:tcPr>
-            <w:tcW w:type="dxa" w:w="3326"/>
+            <w:tcW w:type="dxa" w:w="3175"/>
           </w:tcPr>
           <w:p>
             <w:pPr>
@@ -2778,7 +2778,7 @@
                 <w:rFonts w:ascii="Segoe UI" w:hAnsi="Segoe UI" w:eastAsia="宋体"/>
                 <w:b w:val="0"/>
                 <w:i w:val="0"/>
-                <w:sz w:val="16"/>
+                <w:sz w:val="17"/>
               </w:rPr>
               <w:t>3 个任务 + 预期产出 + 预计 h</w:t>
             </w:r>
@@ -2786,7 +2786,7 @@
         </w:tc>
         <w:tc>
           <w:tcPr>
-            <w:tcW w:type="dxa" w:w="3326"/>
+            <w:tcW w:type="dxa" w:w="2891"/>
           </w:tcPr>
           <w:p>
             <w:pPr>
@@ -2798,7 +2798,7 @@
                 <w:rFonts w:ascii="Segoe UI" w:hAnsi="Segoe UI" w:eastAsia="宋体"/>
                 <w:b w:val="0"/>
                 <w:i w:val="0"/>
-                <w:sz w:val="16"/>
+                <w:sz w:val="17"/>
               </w:rPr>
               <w:t>是不是可验收的产出，而不是"继续研究"</w:t>
             </w:r>
@@ -2808,7 +2808,7 @@
       <w:tr>
         <w:tc>
           <w:tcPr>
-            <w:tcW w:type="dxa" w:w="3326"/>
+            <w:tcW w:type="dxa" w:w="1077"/>
           </w:tcPr>
           <w:p>
             <w:pPr>
@@ -2820,7 +2820,7 @@
                 <w:rFonts w:ascii="Segoe UI" w:hAnsi="Segoe UI" w:eastAsia="宋体"/>
                 <w:b/>
                 <w:i w:val="0"/>
-                <w:sz w:val="16"/>
+                <w:sz w:val="17"/>
               </w:rPr>
               <w:t>5 最重要的负面结果</w:t>
             </w:r>
@@ -2828,7 +2828,7 @@
         </w:tc>
         <w:tc>
           <w:tcPr>
-            <w:tcW w:type="dxa" w:w="3326"/>
+            <w:tcW w:type="dxa" w:w="3175"/>
           </w:tcPr>
           <w:p>
             <w:pPr>
@@ -2840,7 +2840,7 @@
                 <w:rFonts w:ascii="Segoe UI" w:hAnsi="Segoe UI" w:eastAsia="宋体"/>
                 <w:b w:val="0"/>
                 <w:i w:val="0"/>
-                <w:sz w:val="16"/>
+                <w:sz w:val="17"/>
               </w:rPr>
               <w:t>本周最让你难受的那个数字/事实</w:t>
             </w:r>
@@ -2848,7 +2848,7 @@
         </w:tc>
         <w:tc>
           <w:tcPr>
-            <w:tcW w:type="dxa" w:w="3326"/>
+            <w:tcW w:type="dxa" w:w="2891"/>
           </w:tcPr>
           <w:p>
             <w:pPr>
@@ -2860,7 +2860,7 @@
                 <w:rFonts w:ascii="Segoe UI" w:hAnsi="Segoe UI" w:eastAsia="宋体"/>
                 <w:b w:val="0"/>
                 <w:i w:val="0"/>
-                <w:sz w:val="16"/>
+                <w:sz w:val="17"/>
               </w:rPr>
               <w:t>有没有勇气写坏的</w:t>
             </w:r>
@@ -2870,7 +2870,7 @@
       <w:tr>
         <w:tc>
           <w:tcPr>
-            <w:tcW w:type="dxa" w:w="3326"/>
+            <w:tcW w:type="dxa" w:w="1077"/>
           </w:tcPr>
           <w:p>
             <w:pPr>
@@ -2882,7 +2882,7 @@
                 <w:rFonts w:ascii="Segoe UI" w:hAnsi="Segoe UI" w:eastAsia="宋体"/>
                 <w:b/>
                 <w:i w:val="0"/>
-                <w:sz w:val="16"/>
+                <w:sz w:val="17"/>
               </w:rPr>
               <w:t>6 假设变更</w:t>
             </w:r>
@@ -2890,7 +2890,7 @@
         </w:tc>
         <w:tc>
           <w:tcPr>
-            <w:tcW w:type="dxa" w:w="3326"/>
+            <w:tcW w:type="dxa" w:w="3175"/>
           </w:tcPr>
           <w:p>
             <w:pPr>
@@ -2902,7 +2902,7 @@
                 <w:rFonts w:ascii="Segoe UI" w:hAnsi="Segoe UI" w:eastAsia="宋体"/>
                 <w:b w:val="0"/>
                 <w:i w:val="0"/>
-                <w:sz w:val="16"/>
+                <w:sz w:val="17"/>
               </w:rPr>
               <w:t>一句话；没有就写"无变更"</w:t>
             </w:r>
@@ -2910,7 +2910,7 @@
         </w:tc>
         <w:tc>
           <w:tcPr>
-            <w:tcW w:type="dxa" w:w="3326"/>
+            <w:tcW w:type="dxa" w:w="2891"/>
           </w:tcPr>
           <w:p>
             <w:pPr>
@@ -2922,7 +2922,7 @@
                 <w:rFonts w:ascii="Segoe UI" w:hAnsi="Segoe UI" w:eastAsia="宋体"/>
                 <w:b w:val="0"/>
                 <w:i w:val="0"/>
-                <w:sz w:val="16"/>
+                <w:sz w:val="17"/>
               </w:rPr>
               <w:t>假设有没有被数据推动过</w:t>
             </w:r>
@@ -3215,7 +3215,7 @@
         </w:trPr>
         <w:tc>
           <w:tcPr>
-            <w:tcW w:type="dxa" w:w="1996"/>
+            <w:tcW w:type="dxa" w:w="510"/>
             <w:shd w:val="clear" w:color="auto" w:fill="EFEFEF"/>
           </w:tcPr>
           <w:p>
@@ -3237,7 +3237,7 @@
         </w:tc>
         <w:tc>
           <w:tcPr>
-            <w:tcW w:type="dxa" w:w="1996"/>
+            <w:tcW w:type="dxa" w:w="1701"/>
             <w:shd w:val="clear" w:color="auto" w:fill="EFEFEF"/>
           </w:tcPr>
           <w:p>
@@ -3259,7 +3259,7 @@
         </w:tc>
         <w:tc>
           <w:tcPr>
-            <w:tcW w:type="dxa" w:w="1996"/>
+            <w:tcW w:type="dxa" w:w="1474"/>
             <w:shd w:val="clear" w:color="auto" w:fill="EFEFEF"/>
           </w:tcPr>
           <w:p>
@@ -3281,7 +3281,7 @@
         </w:tc>
         <w:tc>
           <w:tcPr>
-            <w:tcW w:type="dxa" w:w="1996"/>
+            <w:tcW w:type="dxa" w:w="1644"/>
             <w:shd w:val="clear" w:color="auto" w:fill="EFEFEF"/>
           </w:tcPr>
           <w:p>
@@ -3303,7 +3303,7 @@
         </w:tc>
         <w:tc>
           <w:tcPr>
-            <w:tcW w:type="dxa" w:w="1996"/>
+            <w:tcW w:type="dxa" w:w="2381"/>
             <w:shd w:val="clear" w:color="auto" w:fill="EFEFEF"/>
           </w:tcPr>
           <w:p>
@@ -3327,7 +3327,7 @@
       <w:tr>
         <w:tc>
           <w:tcPr>
-            <w:tcW w:type="dxa" w:w="1996"/>
+            <w:tcW w:type="dxa" w:w="510"/>
           </w:tcPr>
           <w:p>
             <w:pPr>
@@ -3347,7 +3347,7 @@
         </w:tc>
         <w:tc>
           <w:tcPr>
-            <w:tcW w:type="dxa" w:w="1996"/>
+            <w:tcW w:type="dxa" w:w="1701"/>
           </w:tcPr>
           <w:p>
             <w:pPr>
@@ -3367,7 +3367,7 @@
         </w:tc>
         <w:tc>
           <w:tcPr>
-            <w:tcW w:type="dxa" w:w="1996"/>
+            <w:tcW w:type="dxa" w:w="1474"/>
           </w:tcPr>
           <w:p>
             <w:pPr>
@@ -3405,7 +3405,7 @@
         </w:tc>
         <w:tc>
           <w:tcPr>
-            <w:tcW w:type="dxa" w:w="1996"/>
+            <w:tcW w:type="dxa" w:w="1644"/>
           </w:tcPr>
           <w:p>
             <w:pPr>
@@ -3479,7 +3479,7 @@
         </w:tc>
         <w:tc>
           <w:tcPr>
-            <w:tcW w:type="dxa" w:w="1996"/>
+            <w:tcW w:type="dxa" w:w="2381"/>
           </w:tcPr>
           <w:p>
             <w:pPr>
@@ -3501,7 +3501,7 @@
       <w:tr>
         <w:tc>
           <w:tcPr>
-            <w:tcW w:type="dxa" w:w="1996"/>
+            <w:tcW w:type="dxa" w:w="510"/>
           </w:tcPr>
           <w:p>
             <w:pPr>
@@ -3521,7 +3521,7 @@
         </w:tc>
         <w:tc>
           <w:tcPr>
-            <w:tcW w:type="dxa" w:w="1996"/>
+            <w:tcW w:type="dxa" w:w="1701"/>
           </w:tcPr>
           <w:p>
             <w:pPr>
@@ -3541,7 +3541,7 @@
         </w:tc>
         <w:tc>
           <w:tcPr>
-            <w:tcW w:type="dxa" w:w="1996"/>
+            <w:tcW w:type="dxa" w:w="1474"/>
           </w:tcPr>
           <w:p>
             <w:pPr>
@@ -3579,7 +3579,7 @@
         </w:tc>
         <w:tc>
           <w:tcPr>
-            <w:tcW w:type="dxa" w:w="1996"/>
+            <w:tcW w:type="dxa" w:w="1644"/>
           </w:tcPr>
           <w:p>
             <w:pPr>
@@ -3617,7 +3617,7 @@
         </w:tc>
         <w:tc>
           <w:tcPr>
-            <w:tcW w:type="dxa" w:w="1996"/>
+            <w:tcW w:type="dxa" w:w="2381"/>
           </w:tcPr>
           <w:p>
             <w:pPr>
@@ -3639,7 +3639,7 @@
       <w:tr>
         <w:tc>
           <w:tcPr>
-            <w:tcW w:type="dxa" w:w="1996"/>
+            <w:tcW w:type="dxa" w:w="510"/>
           </w:tcPr>
           <w:p>
             <w:pPr>
@@ -3659,7 +3659,7 @@
         </w:tc>
         <w:tc>
           <w:tcPr>
-            <w:tcW w:type="dxa" w:w="1996"/>
+            <w:tcW w:type="dxa" w:w="1701"/>
           </w:tcPr>
           <w:p>
             <w:pPr>
@@ -3706,7 +3706,7 @@
         </w:tc>
         <w:tc>
           <w:tcPr>
-            <w:tcW w:type="dxa" w:w="1996"/>
+            <w:tcW w:type="dxa" w:w="1474"/>
           </w:tcPr>
           <w:p>
             <w:pPr>
@@ -3726,7 +3726,7 @@
         </w:tc>
         <w:tc>
           <w:tcPr>
-            <w:tcW w:type="dxa" w:w="1996"/>
+            <w:tcW w:type="dxa" w:w="1644"/>
           </w:tcPr>
           <w:p>
             <w:pPr>
@@ -3746,7 +3746,7 @@
         </w:tc>
         <w:tc>
           <w:tcPr>
-            <w:tcW w:type="dxa" w:w="1996"/>
+            <w:tcW w:type="dxa" w:w="2381"/>
           </w:tcPr>
           <w:p>
             <w:pPr>

</xml_diff>

<commit_message>
W3: real MVTec AD experiment (decision disagreement + interval screening), repro AUROC, figures, week report; Gate 1 = GO
</commit_message>
<xml_diff>
--- a/PROGRESS_BOARD.docx
+++ b/PROGRESS_BOARD.docx
@@ -15,6 +15,71 @@
           <w:sz w:val="34"/>
         </w:rPr>
         <w:t>进度看板与成果查阅指南</w:t>
+      </w:r>
+    </w:p>
+    <w:p>
+      <w:pPr>
+        <w:spacing w:before="0" w:after="40" w:line="264" w:lineRule="auto"/>
+        <w:ind w:left="283"/>
+      </w:pPr>
+      <w:r>
+        <w:rPr>
+          <w:rFonts w:ascii="Segoe UI" w:hAnsi="Segoe UI" w:eastAsia="宋体"/>
+          <w:b/>
+          <w:i/>
+          <w:color w:val="444444"/>
+          <w:sz w:val="19"/>
+        </w:rPr>
+        <w:t>2026-10-11 更新</w:t>
+      </w:r>
+      <w:r>
+        <w:rPr>
+          <w:rFonts w:ascii="Segoe UI" w:hAnsi="Segoe UI" w:eastAsia="宋体"/>
+          <w:b w:val="0"/>
+          <w:i/>
+          <w:color w:val="444444"/>
+          <w:sz w:val="19"/>
+        </w:rPr>
+        <w:t xml:space="preserve">：W3 已完成（真实数据实验），见 </w:t>
+      </w:r>
+      <w:r>
+        <w:rPr>
+          <w:rFonts w:ascii="Consolas" w:hAnsi="Consolas" w:eastAsia="Consolas"/>
+          <w:b w:val="0"/>
+          <w:color w:val="444444"/>
+          <w:sz w:val="18"/>
+        </w:rPr>
+        <w:t>week3/W3_WEEKLY_REPORT.pdf</w:t>
+      </w:r>
+      <w:r>
+        <w:rPr>
+          <w:rFonts w:ascii="Segoe UI" w:hAnsi="Segoe UI" w:eastAsia="宋体"/>
+          <w:b w:val="0"/>
+          <w:i/>
+          <w:color w:val="444444"/>
+          <w:sz w:val="19"/>
+        </w:rPr>
+        <w:t xml:space="preserve">；Gate 1 判定 </w:t>
+      </w:r>
+      <w:r>
+        <w:rPr>
+          <w:rFonts w:ascii="Segoe UI" w:hAnsi="Segoe UI" w:eastAsia="宋体"/>
+          <w:b/>
+          <w:i/>
+          <w:color w:val="444444"/>
+          <w:sz w:val="19"/>
+        </w:rPr>
+        <w:t>GO</w:t>
+      </w:r>
+      <w:r>
+        <w:rPr>
+          <w:rFonts w:ascii="Segoe UI" w:hAnsi="Segoe UI" w:eastAsia="宋体"/>
+          <w:b w:val="0"/>
+          <w:i/>
+          <w:color w:val="444444"/>
+          <w:sz w:val="19"/>
+        </w:rPr>
+        <w:t>。</w:t>
       </w:r>
     </w:p>
     <w:p>

</xml_diff>